<commit_message>
Define limb-column before using it, and cut the limb etymology down
The introduction used "limb-columns" in the survey paragraph, sixty-three
lines before section 2 defined the term. The definition moves up to where
limbs are introduced, and section 2 now uses the term rather than coining it a
second time.

The etymology went too: two quotations from the GMP manual, the aside about
human limbs, and the note that GMP allows 32 or 64 bits, none of which the
reader needs to follow the paper. What remains is "GMP's term for the segments
of a multi-precision number that each fit in a single machine word", with the
citation intact for anyone who wants the rest. The article keeps the full
quotations, which is what its footnote is for.

Co-Authored-By: Claude Opus 5 (1M context) <noreply@anthropic.com>
</commit_message>
<xml_diff>
--- a/truesum/paper/truesum-toms.docx
+++ b/truesum/paper/truesum-toms.docx
@@ -130,7 +130,117 @@
         <w:t>limbs</w:t>
       </w:r>
       <w:r>
-        <w:t xml:space="preserve">, the segments of a multi-precision number that each fit in a single machine word. The term appears to have been coined by the authors of GMP, whose manual defines a limb as “the part of a multi-precision number that fits in a single machine word” and explains the choice: “a limb of the human body is analogous to a digit, only larger, and containing several digits” [Granlund and the GMP Development Team 2023]. GMP allows 32 or 64 bits; </w:t>
+        <w:t xml:space="preserve">, GMP's term for the segments of a multi-precision number that each fit in a single machine word [Granlund and the GMP Development Team 2023]. Storage is per limb position rather than per element: one contiguous array holds limb </w:t>
+      </w:r>
+      <w:r>
+        <w:rPr>
+          <w:i/>
+        </w:rPr>
+        <w:t>k</w:t>
+      </w:r>
+      <w:r>
+        <w:t xml:space="preserve"> of every row, and we call such an array a </w:t>
+      </w:r>
+      <w:r>
+        <w:rPr>
+          <w:i/>
+        </w:rPr>
+        <w:t>limb-column</w:t>
+      </w:r>
+      <w:r>
+        <w:t>, for want of a better term.</w:t>
+      </w:r>
+    </w:p>
+    <w:p>
+      <w:pPr>
+        <w:pStyle w:val="Para"/>
+      </w:pPr>
+      <w:r>
+        <w:t xml:space="preserve">A </w:t>
+      </w:r>
+      <w:r>
+        <w:rPr>
+          <w:i/>
+        </w:rPr>
+        <w:t>survey</w:t>
+      </w:r>
+      <w:r>
+        <w:t xml:space="preserve"> is a compact (12 bytes per column) characterization of an input matrix that may be used to pre-size an accumulation matrix to receive its contents without overflow, rescaling, or the allocation of new limb-columns during the accumulation. Extending this idea, an accumulation matrix can be pre-configured for multiple input matrices by supplying one survey for each prospective input matrix.</w:t>
+      </w:r>
+    </w:p>
+    <w:p>
+      <w:pPr>
+        <w:pStyle w:val="Para"/>
+      </w:pPr>
+      <w:r>
+        <w:t>A final feature of the accumulation matrix is that it can return the mean, exactly rounded, an operation that is both faster and more accurate than requiring the client to divide a readback by the number of accumulations.</w:t>
+      </w:r>
+    </w:p>
+    <w:p>
+      <w:pPr>
+        <w:pStyle w:val="Para"/>
+      </w:pPr>
+      <w:r>
+        <w:t>Both AVX-512 and CUDA implementations are provided, and both saturate the bandwidth on their respective platforms. Batched submissions conserve bandwidth to the accumulation matrix on both platforms, and the CUDA implementation optionally takes a stream parameter so API clients can coordinate concurrent data movement and accumulation.</w:t>
+      </w:r>
+    </w:p>
+    <w:p>
+      <w:pPr>
+        <w:pStyle w:val="Head2"/>
+      </w:pPr>
+      <w:r>
+        <w:t>Prior Work</w:t>
+      </w:r>
+    </w:p>
+    <w:p>
+      <w:pPr>
+        <w:pStyle w:val="PostHeadPara"/>
+      </w:pPr>
+      <w:r>
+        <w:t xml:space="preserve">Exact summation is not a new idea, and the fixed-point accumulator is its oldest form. Kulisch's </w:t>
+      </w:r>
+      <w:r>
+        <w:rPr>
+          <w:i/>
+        </w:rPr>
+        <w:t>complete register</w:t>
+      </w:r>
+      <w:r>
+        <w:t xml:space="preserve"> takes the approach to its limit: an accumulator spanning the entire exponent range of the format, 4288 bits wide for dot products of </w:t>
+      </w:r>
+      <w:r>
+        <w:rPr>
+          <w:rStyle w:val="In-textcode"/>
+        </w:rPr>
+        <w:t>double</w:t>
+      </w:r>
+      <w:r>
+        <w:t xml:space="preserve">s, of which 88 are headroom so that up to 2⁸⁸ products can be added without rounding or overflow [Kulisch 2008; Kulisch and Snyder 2011a; 2011b]. Neal's superaccumulators do the same in software, sixty-seven 64-bit chunks overlapping by 32 bits so that carries need not propagate on every add [Neal 2015]. ExBLAS pairs a 2098-bit superaccumulator with floating-point expansions held in registers, and takes both onto GPUs [Iakymchuk et al. 2015; Collange et al. 2015]. ReproBLAS gives up exactness for reproducibility alone: it splits each addend into slices along a predefined grid of 40-bit bins and keeps only the three bins at and below the largest addend seen so far, so its accumulator occupies six </w:t>
+      </w:r>
+      <w:r>
+        <w:rPr>
+          <w:rStyle w:val="In-textcode"/>
+        </w:rPr>
+        <w:t>double</w:t>
+      </w:r>
+      <w:r>
+        <w:t>s [Demmel et al. 2016; Ahrens et al. 2020].</w:t>
+      </w:r>
+    </w:p>
+    <w:p>
+      <w:pPr>
+        <w:pStyle w:val="Para"/>
+      </w:pPr>
+      <w:r>
+        <w:t>A recent study that swapped ExBLAS and ReproBLAS, along with a third library, OzBLAS, into distributed Krylov solvers illustrated the tradeoffs between these two choices [Lei et al. 2025]. ReproBLAS was on average the fastest of the methods tested, ahead even of an ordinary MPI reduction, but on the more ill-conditioned dot products its relative error reached order one, as an ordinary sum's did. ExBLAS stayed correctly rounded throughout, at 9 to 29 times the ordinary cost per iteration.</w:t>
+      </w:r>
+    </w:p>
+    <w:p>
+      <w:pPr>
+        <w:pStyle w:val="Para"/>
+      </w:pPr>
+      <w:r>
+        <w:t xml:space="preserve">Kulisch, Neal and ExBLAS share an accumulator whose width is a property of the format rather than of the data: 4288 bits, whether the values span four binades or four hundred. Demmel and Nguyen's first reproducible sum sized itself from the data, computing max|xᵢ| before adding anything and setting its rounding boundary from that maximum and the count [Demmel and Nguyen 2013; 2015]. Demmel et al. [2016] call that the simplest approach and reject it on cost: “The trouble with this simple approach is that it requires 2 or 3 passes over the data, or 3 communication steps in parallel.” The predefined bins of ReproBLAS are how they got to one pass. </w:t>
       </w:r>
       <w:r>
         <w:rPr>
@@ -139,7 +249,23 @@
         <w:t>truesum</w:t>
       </w:r>
       <w:r>
-        <w:t xml:space="preserve"> uses 64.</w:t>
+        <w:t xml:space="preserve"> keeps the pass and moves it: each column is sized to the dynamic range it actually holds, and surveys, computed by whichever device already has the data, enable those columns to be pre-sized before accumulation begins.</w:t>
+      </w:r>
+    </w:p>
+    <w:p>
+      <w:pPr>
+        <w:pStyle w:val="Head1"/>
+      </w:pPr>
+      <w:r>
+        <w:t>STRUCTURE OF ARRAYS</w:t>
+      </w:r>
+    </w:p>
+    <w:p>
+      <w:pPr>
+        <w:pStyle w:val="PostHeadPara"/>
+      </w:pPr>
+      <w:r>
+        <w:t>The SOA layout enables both AVX-512 and CUDA implementations to process summations at the speed of memory bandwidth.</w:t>
       </w:r>
     </w:p>
     <w:p>
@@ -147,123 +273,6 @@
         <w:pStyle w:val="Para"/>
       </w:pPr>
       <w:r>
-        <w:t xml:space="preserve">A </w:t>
-      </w:r>
-      <w:r>
-        <w:rPr>
-          <w:i/>
-        </w:rPr>
-        <w:t>survey</w:t>
-      </w:r>
-      <w:r>
-        <w:t xml:space="preserve"> is a compact (12 bytes per column) characterization of an input matrix that may be used to pre-size an accumulation matrix to receive its contents without overflow, rescaling, or the allocation of new limb-columns during the accumulation. Extending this idea, an accumulation matrix can be pre-configured for multiple input matrices by supplying one survey for each prospective input matrix.</w:t>
-      </w:r>
-    </w:p>
-    <w:p>
-      <w:pPr>
-        <w:pStyle w:val="Para"/>
-      </w:pPr>
-      <w:r>
-        <w:t>A final feature of the accumulation matrix is that it can return the mean, exactly rounded, an operation that is both faster and more accurate than requiring the client to divide a readback by the number of accumulations.</w:t>
-      </w:r>
-    </w:p>
-    <w:p>
-      <w:pPr>
-        <w:pStyle w:val="Para"/>
-      </w:pPr>
-      <w:r>
-        <w:t>Both AVX-512 and CUDA implementations are provided, and both saturate the bandwidth on their respective platforms. Batched submissions conserve bandwidth to the accumulation matrix on both platforms, and the CUDA implementation optionally takes a stream parameter so API clients can coordinate concurrent data movement and accumulation.</w:t>
-      </w:r>
-    </w:p>
-    <w:p>
-      <w:pPr>
-        <w:pStyle w:val="Head2"/>
-      </w:pPr>
-      <w:r>
-        <w:t>Prior Work</w:t>
-      </w:r>
-    </w:p>
-    <w:p>
-      <w:pPr>
-        <w:pStyle w:val="PostHeadPara"/>
-      </w:pPr>
-      <w:r>
-        <w:t xml:space="preserve">Exact summation is not a new idea, and the fixed-point accumulator is its oldest form. Kulisch's </w:t>
-      </w:r>
-      <w:r>
-        <w:rPr>
-          <w:i/>
-        </w:rPr>
-        <w:t>complete register</w:t>
-      </w:r>
-      <w:r>
-        <w:t xml:space="preserve"> takes the approach to its limit: an accumulator spanning the entire exponent range of the format, 4288 bits wide for dot products of </w:t>
-      </w:r>
-      <w:r>
-        <w:rPr>
-          <w:rStyle w:val="In-textcode"/>
-        </w:rPr>
-        <w:t>double</w:t>
-      </w:r>
-      <w:r>
-        <w:t xml:space="preserve">s, of which 88 are headroom so that up to 2⁸⁸ products can be added without rounding or overflow [Kulisch 2008; Kulisch and Snyder 2011a; 2011b]. Neal's superaccumulators do the same in software, sixty-seven 64-bit chunks overlapping by 32 bits so that carries need not propagate on every add [Neal 2015]. ExBLAS pairs a 2098-bit superaccumulator with floating-point expansions held in registers, and takes both onto GPUs [Iakymchuk et al. 2015; Collange et al. 2015]. ReproBLAS gives up exactness for reproducibility alone: it splits each addend into slices along a predefined grid of 40-bit bins and keeps only the three bins at and below the largest addend seen so far, so its accumulator occupies six </w:t>
-      </w:r>
-      <w:r>
-        <w:rPr>
-          <w:rStyle w:val="In-textcode"/>
-        </w:rPr>
-        <w:t>double</w:t>
-      </w:r>
-      <w:r>
-        <w:t>s [Demmel et al. 2016; Ahrens et al. 2020].</w:t>
-      </w:r>
-    </w:p>
-    <w:p>
-      <w:pPr>
-        <w:pStyle w:val="Para"/>
-      </w:pPr>
-      <w:r>
-        <w:t>A recent study that swapped ExBLAS and ReproBLAS, along with a third library, OzBLAS, into distributed Krylov solvers illustrated the tradeoffs between these two choices [Lei et al. 2025]. ReproBLAS was on average the fastest of the methods tested, ahead even of an ordinary MPI reduction, but on the more ill-conditioned dot products its relative error reached order one, as an ordinary sum's did. ExBLAS stayed correctly rounded throughout, at 9 to 29 times the ordinary cost per iteration.</w:t>
-      </w:r>
-    </w:p>
-    <w:p>
-      <w:pPr>
-        <w:pStyle w:val="Para"/>
-      </w:pPr>
-      <w:r>
-        <w:t xml:space="preserve">Kulisch, Neal and ExBLAS share an accumulator whose width is a property of the format rather than of the data: 4288 bits, whether the values span four binades or four hundred. Demmel and Nguyen's first reproducible sum sized itself from the data, computing max|xᵢ| before adding anything and setting its rounding boundary from that maximum and the count [Demmel and Nguyen 2013; 2015]. Demmel et al. [2016] call that the simplest approach and reject it on cost: “The trouble with this simple approach is that it requires 2 or 3 passes over the data, or 3 communication steps in parallel.” The predefined bins of ReproBLAS are how they got to one pass. </w:t>
-      </w:r>
-      <w:r>
-        <w:rPr>
-          <w:rStyle w:val="In-textcode"/>
-        </w:rPr>
-        <w:t>truesum</w:t>
-      </w:r>
-      <w:r>
-        <w:t xml:space="preserve"> keeps the pass and moves it: each column is sized to the dynamic range it actually holds, and surveys, computed by whichever device already has the data, enable those columns to be pre-sized before accumulation begins.</w:t>
-      </w:r>
-    </w:p>
-    <w:p>
-      <w:pPr>
-        <w:pStyle w:val="Head1"/>
-      </w:pPr>
-      <w:r>
-        <w:t>STRUCTURE OF ARRAYS</w:t>
-      </w:r>
-    </w:p>
-    <w:p>
-      <w:pPr>
-        <w:pStyle w:val="PostHeadPara"/>
-      </w:pPr>
-      <w:r>
-        <w:t>The SOA layout enables both AVX-512 and CUDA implementations to process summations at the speed of memory bandwidth.</w:t>
-      </w:r>
-    </w:p>
-    <w:p>
-      <w:pPr>
-        <w:pStyle w:val="Para"/>
-      </w:pPr>
-      <w:r>
         <w:t xml:space="preserve">Within the matrix, a single element is stored as a two's complement integer spanning several 64-bit limbs. Written the usual way (most significant first), it reads </w:t>
       </w:r>
       <w:r>
@@ -273,16 +282,7 @@
         <w:t>[ limb 2 | limb 1 | limb 0 ]</w:t>
       </w:r>
       <w:r>
-        <w:t xml:space="preserve">. The SOA layout provides for a separate, contiguous allocation per limb position, so limbs 0, 1 and 2 for a given element are stored at the same offset into three different arrays. For want of a better term, we refer to these arrays as </w:t>
-      </w:r>
-      <w:r>
-        <w:rPr>
-          <w:i/>
-        </w:rPr>
-        <w:t>limb-columns</w:t>
-      </w:r>
-      <w:r>
-        <w:t xml:space="preserve"> (Figure 1).</w:t>
+        <w:t>. Each limb position has its own separate, contiguous allocation, so limbs 0, 1 and 2 for a given element are stored at the same offset into three different limb-columns (Figure 1).</w:t>
       </w:r>
     </w:p>
     <w:p>

</xml_diff>